<commit_message>
The MVP deployment model is a centralized, customer/team-controlled shared server.
</commit_message>
<xml_diff>
--- a/Requirements_and_documents/Problem_Solutions/Phase 1-Solution-Deployment-Model.docx
+++ b/Requirements_and_documents/Problem_Solutions/Phase 1-Solution-Deployment-Model.docx
@@ -113,16 +113,6 @@
     <w:p>
       <w:pPr>
         <w:pStyle w:val="a4"/>
-        <w:ind w:firstLine="420"/>
-      </w:pPr>
-      <w:r>
-        <w:t>During the discussion, three possible deployment directions were considered:</w:t>
-      </w:r>
-    </w:p>
-    <w:p>
-      <w:pPr>
-        <w:pStyle w:val="a4"/>
-        <w:ind w:firstLine="420"/>
       </w:pPr>
     </w:p>
     <w:p>
@@ -142,35 +132,13 @@
           <w:b/>
           <w:bCs/>
         </w:rPr>
-        <w:t>Option A: Per-user full local deployment</w:t>
+        <w:t>Option B: Customer/team-controlled centralized deployment</w:t>
       </w:r>
     </w:p>
     <w:p>
       <w:pPr>
         <w:pStyle w:val="a4"/>
         <w:ind w:firstLine="420"/>
-      </w:pPr>
-      <w:r>
-        <w:t>Each user runs their own application, database, and AI runtime locally.</w:t>
-      </w:r>
-    </w:p>
-    <w:p>
-      <w:pPr>
-        <w:pStyle w:val="a4"/>
-      </w:pPr>
-    </w:p>
-    <w:p>
-      <w:pPr>
-        <w:pStyle w:val="a4"/>
-      </w:pPr>
-    </w:p>
-    <w:p>
-      <w:pPr>
-        <w:pStyle w:val="a4"/>
-        <w:numPr>
-          <w:ilvl w:val="0"/>
-          <w:numId w:val="1"/>
-        </w:numPr>
         <w:rPr>
           <w:b/>
           <w:bCs/>
@@ -181,13 +149,26 @@
           <w:b/>
           <w:bCs/>
         </w:rPr>
-        <w:t>Option B: Customer/team-controlled centralized deployment</w:t>
-      </w:r>
-    </w:p>
-    <w:p>
-      <w:pPr>
-        <w:pStyle w:val="a4"/>
-        <w:ind w:firstLine="420"/>
+        <w:t>One shared server runs the platform, database, workflow engine, GitHub integration, and AI runtime. Users access the platform through a browser.</w:t>
+      </w:r>
+    </w:p>
+    <w:p>
+      <w:pPr>
+        <w:pStyle w:val="a4"/>
+      </w:pPr>
+    </w:p>
+    <w:p>
+      <w:pPr>
+        <w:pStyle w:val="a4"/>
+      </w:pPr>
+    </w:p>
+    <w:p>
+      <w:pPr>
+        <w:pStyle w:val="a4"/>
+        <w:numPr>
+          <w:ilvl w:val="0"/>
+          <w:numId w:val="1"/>
+        </w:numPr>
         <w:rPr>
           <w:b/>
           <w:bCs/>
@@ -198,36 +179,6 @@
           <w:b/>
           <w:bCs/>
         </w:rPr>
-        <w:t>One shared server runs the platform, database, workflow engine, GitHub integration, and AI runtime. Users access the platform through a browser.</w:t>
-      </w:r>
-    </w:p>
-    <w:p>
-      <w:pPr>
-        <w:pStyle w:val="a4"/>
-      </w:pPr>
-    </w:p>
-    <w:p>
-      <w:pPr>
-        <w:pStyle w:val="a4"/>
-      </w:pPr>
-    </w:p>
-    <w:p>
-      <w:pPr>
-        <w:pStyle w:val="a4"/>
-        <w:numPr>
-          <w:ilvl w:val="0"/>
-          <w:numId w:val="1"/>
-        </w:numPr>
-        <w:rPr>
-          <w:b/>
-          <w:bCs/>
-        </w:rPr>
-      </w:pPr>
-      <w:r>
-        <w:rPr>
-          <w:b/>
-          <w:bCs/>
-        </w:rPr>
         <w:t>Option C: Vendor-hosted SaaS deployment</w:t>
       </w:r>
     </w:p>
@@ -251,12 +202,7 @@
         <w:ind w:firstLine="420"/>
       </w:pPr>
       <w:r>
-        <w:lastRenderedPageBreak/>
-        <w:t xml:space="preserve">For the </w:t>
-      </w:r>
-      <w:proofErr w:type="gramStart"/>
-      <w:r>
-        <w:t>MVP</w:t>
+        <w:t>For the MVP</w:t>
       </w:r>
       <w:r>
         <w:rPr>
@@ -264,7 +210,6 @@
         </w:rPr>
         <w:t>(</w:t>
       </w:r>
-      <w:proofErr w:type="gramEnd"/>
       <w:r>
         <w:rPr>
           <w:rFonts w:eastAsia="SimSun"/>
@@ -339,6 +284,7 @@
           <w:sz w:val="21"/>
           <w:szCs w:val="21"/>
         </w:rPr>
+        <w:lastRenderedPageBreak/>
         <w:t>Backend API</w:t>
       </w:r>
     </w:p>
@@ -528,6 +474,26 @@
     </w:p>
     <w:p>
       <w:pPr>
+        <w:widowControl/>
+        <w:jc w:val="left"/>
+        <w:rPr>
+          <w:rFonts w:ascii="Times New Roman" w:eastAsia="SimSun" w:hAnsi="Times New Roman" w:cs="Times New Roman"/>
+          <w:b/>
+          <w:bCs/>
+          <w:kern w:val="0"/>
+          <w:sz w:val="36"/>
+          <w:szCs w:val="36"/>
+        </w:rPr>
+      </w:pPr>
+      <w:r>
+        <w:rPr>
+          <w:rFonts w:ascii="Times New Roman" w:hAnsi="Times New Roman"/>
+        </w:rPr>
+        <w:br w:type="page"/>
+      </w:r>
+    </w:p>
+    <w:p>
+      <w:pPr>
         <w:pStyle w:val="2"/>
         <w:rPr>
           <w:rFonts w:ascii="Times New Roman" w:hAnsi="Times New Roman" w:hint="default"/>
@@ -1204,14 +1170,12 @@
           <w:rFonts w:ascii="Times New Roman" w:hAnsi="Times New Roman" w:cs="Times New Roman"/>
         </w:rPr>
       </w:pPr>
-      <w:proofErr w:type="spellStart"/>
       <w:r>
         <w:rPr>
           <w:rFonts w:ascii="Times New Roman" w:hAnsi="Times New Roman" w:cs="Times New Roman"/>
         </w:rPr>
         <w:t>Tailscale</w:t>
       </w:r>
-      <w:proofErr w:type="spellEnd"/>
     </w:p>
     <w:p>
       <w:pPr>
@@ -1225,14 +1189,12 @@
           <w:rFonts w:ascii="Times New Roman" w:hAnsi="Times New Roman" w:cs="Times New Roman"/>
         </w:rPr>
       </w:pPr>
-      <w:proofErr w:type="spellStart"/>
       <w:r>
         <w:rPr>
           <w:rFonts w:ascii="Times New Roman" w:hAnsi="Times New Roman" w:cs="Times New Roman"/>
         </w:rPr>
         <w:t>ZeroTier</w:t>
       </w:r>
-      <w:proofErr w:type="spellEnd"/>
     </w:p>
     <w:p>
       <w:pPr>
@@ -1521,6 +1483,21 @@
     </w:p>
     <w:p>
       <w:pPr>
+        <w:pStyle w:val="3"/>
+        <w:widowControl/>
+        <w:rPr>
+          <w:rFonts w:ascii="Times New Roman" w:hAnsi="Times New Roman" w:hint="default"/>
+        </w:rPr>
+      </w:pPr>
+      <w:r>
+        <w:rPr>
+          <w:rFonts w:ascii="Times New Roman" w:hAnsi="Times New Roman" w:hint="default"/>
+        </w:rPr>
+        <w:t xml:space="preserve"> Shared Responsibility</w:t>
+      </w:r>
+    </w:p>
+    <w:p>
+      <w:pPr>
         <w:pStyle w:val="Web"/>
         <w:widowControl/>
         <w:rPr>
@@ -1531,26 +1508,289 @@
         <w:rPr>
           <w:rFonts w:ascii="Times New Roman" w:hAnsi="Times New Roman"/>
         </w:rPr>
-        <w:t xml:space="preserve">This point remains open for team </w:t>
-      </w:r>
-      <w:proofErr w:type="gramStart"/>
-      <w:r>
-        <w:rPr>
-          <w:rFonts w:ascii="Times New Roman" w:hAnsi="Times New Roman"/>
-        </w:rPr>
-        <w:t>decision</w:t>
-      </w:r>
-      <w:proofErr w:type="gramEnd"/>
-      <w:r>
-        <w:rPr>
-          <w:rFonts w:ascii="Times New Roman" w:hAnsi="Times New Roman"/>
-        </w:rPr>
-        <w:t>.</w:t>
-      </w:r>
-    </w:p>
-    <w:p>
-      <w:pPr>
-        <w:pStyle w:val="3"/>
+        <w:t>The customer is responsible for the infrastructure environment, while the development team is responsible for providing the software, deployment guidance, and secure configuration design.</w:t>
+      </w:r>
+    </w:p>
+    <w:p>
+      <w:pPr>
+        <w:pStyle w:val="Web"/>
+        <w:widowControl/>
+        <w:rPr>
+          <w:rFonts w:ascii="Times New Roman" w:hAnsi="Times New Roman"/>
+        </w:rPr>
+      </w:pPr>
+      <w:r>
+        <w:rPr>
+          <w:rFonts w:ascii="Times New Roman" w:hAnsi="Times New Roman"/>
+        </w:rPr>
+        <w:t>Customer responsibilities include:</w:t>
+      </w:r>
+    </w:p>
+    <w:p>
+      <w:pPr>
+        <w:widowControl/>
+        <w:numPr>
+          <w:ilvl w:val="0"/>
+          <w:numId w:val="7"/>
+        </w:numPr>
+        <w:spacing w:beforeAutospacing="1" w:afterAutospacing="1"/>
+        <w:rPr>
+          <w:rFonts w:ascii="Times New Roman" w:hAnsi="Times New Roman" w:cs="Times New Roman"/>
+        </w:rPr>
+      </w:pPr>
+      <w:r>
+        <w:rPr>
+          <w:rFonts w:ascii="Times New Roman" w:hAnsi="Times New Roman" w:cs="Times New Roman"/>
+        </w:rPr>
+        <w:t>Server or virtual machine</w:t>
+      </w:r>
+    </w:p>
+    <w:p>
+      <w:pPr>
+        <w:widowControl/>
+        <w:numPr>
+          <w:ilvl w:val="0"/>
+          <w:numId w:val="7"/>
+        </w:numPr>
+        <w:spacing w:beforeAutospacing="1" w:afterAutospacing="1"/>
+        <w:rPr>
+          <w:rFonts w:ascii="Times New Roman" w:hAnsi="Times New Roman" w:cs="Times New Roman"/>
+        </w:rPr>
+      </w:pPr>
+      <w:r>
+        <w:rPr>
+          <w:rFonts w:ascii="Times New Roman" w:hAnsi="Times New Roman" w:cs="Times New Roman"/>
+        </w:rPr>
+        <w:t>Network access</w:t>
+      </w:r>
+    </w:p>
+    <w:p>
+      <w:pPr>
+        <w:widowControl/>
+        <w:numPr>
+          <w:ilvl w:val="0"/>
+          <w:numId w:val="7"/>
+        </w:numPr>
+        <w:spacing w:beforeAutospacing="1" w:afterAutospacing="1"/>
+        <w:rPr>
+          <w:rFonts w:ascii="Times New Roman" w:hAnsi="Times New Roman" w:cs="Times New Roman"/>
+        </w:rPr>
+      </w:pPr>
+      <w:r>
+        <w:rPr>
+          <w:rFonts w:ascii="Times New Roman" w:hAnsi="Times New Roman" w:cs="Times New Roman"/>
+        </w:rPr>
+        <w:t>Storage</w:t>
+      </w:r>
+    </w:p>
+    <w:p>
+      <w:pPr>
+        <w:widowControl/>
+        <w:numPr>
+          <w:ilvl w:val="0"/>
+          <w:numId w:val="7"/>
+        </w:numPr>
+        <w:spacing w:beforeAutospacing="1" w:afterAutospacing="1"/>
+        <w:rPr>
+          <w:rFonts w:ascii="Times New Roman" w:hAnsi="Times New Roman" w:cs="Times New Roman"/>
+        </w:rPr>
+      </w:pPr>
+      <w:r>
+        <w:rPr>
+          <w:rFonts w:ascii="Times New Roman" w:hAnsi="Times New Roman" w:cs="Times New Roman"/>
+        </w:rPr>
+        <w:t>Backup policy</w:t>
+      </w:r>
+    </w:p>
+    <w:p>
+      <w:pPr>
+        <w:widowControl/>
+        <w:numPr>
+          <w:ilvl w:val="0"/>
+          <w:numId w:val="7"/>
+        </w:numPr>
+        <w:spacing w:beforeAutospacing="1" w:afterAutospacing="1"/>
+        <w:rPr>
+          <w:rFonts w:ascii="Times New Roman" w:hAnsi="Times New Roman" w:cs="Times New Roman"/>
+        </w:rPr>
+      </w:pPr>
+      <w:r>
+        <w:rPr>
+          <w:rFonts w:ascii="Times New Roman" w:hAnsi="Times New Roman" w:cs="Times New Roman"/>
+        </w:rPr>
+        <w:t>CPU/GPU resources</w:t>
+      </w:r>
+    </w:p>
+    <w:p>
+      <w:pPr>
+        <w:widowControl/>
+        <w:numPr>
+          <w:ilvl w:val="0"/>
+          <w:numId w:val="7"/>
+        </w:numPr>
+        <w:spacing w:beforeAutospacing="1" w:afterAutospacing="1"/>
+        <w:rPr>
+          <w:rFonts w:ascii="Times New Roman" w:hAnsi="Times New Roman" w:cs="Times New Roman"/>
+        </w:rPr>
+      </w:pPr>
+      <w:r>
+        <w:rPr>
+          <w:rFonts w:ascii="Times New Roman" w:hAnsi="Times New Roman" w:cs="Times New Roman"/>
+        </w:rPr>
+        <w:t>Remote access through VPN or tunneling if needed</w:t>
+      </w:r>
+    </w:p>
+    <w:p>
+      <w:pPr>
+        <w:widowControl/>
+        <w:numPr>
+          <w:ilvl w:val="0"/>
+          <w:numId w:val="7"/>
+        </w:numPr>
+        <w:spacing w:beforeAutospacing="1" w:afterAutospacing="1"/>
+        <w:rPr>
+          <w:rFonts w:ascii="Times New Roman" w:hAnsi="Times New Roman" w:cs="Times New Roman"/>
+        </w:rPr>
+      </w:pPr>
+      <w:r>
+        <w:rPr>
+          <w:rFonts w:ascii="Times New Roman" w:hAnsi="Times New Roman" w:cs="Times New Roman"/>
+        </w:rPr>
+        <w:t>Infrastructure-level security</w:t>
+      </w:r>
+    </w:p>
+    <w:p>
+      <w:pPr>
+        <w:pStyle w:val="Web"/>
+        <w:widowControl/>
+        <w:rPr>
+          <w:rFonts w:ascii="Times New Roman" w:hAnsi="Times New Roman"/>
+        </w:rPr>
+      </w:pPr>
+      <w:r>
+        <w:rPr>
+          <w:rFonts w:ascii="Times New Roman" w:hAnsi="Times New Roman"/>
+        </w:rPr>
+        <w:t>Development team responsibilities include:</w:t>
+      </w:r>
+    </w:p>
+    <w:p>
+      <w:pPr>
+        <w:widowControl/>
+        <w:numPr>
+          <w:ilvl w:val="0"/>
+          <w:numId w:val="8"/>
+        </w:numPr>
+        <w:spacing w:beforeAutospacing="1" w:afterAutospacing="1"/>
+        <w:rPr>
+          <w:rFonts w:ascii="Times New Roman" w:hAnsi="Times New Roman" w:cs="Times New Roman"/>
+        </w:rPr>
+      </w:pPr>
+      <w:r>
+        <w:rPr>
+          <w:rFonts w:ascii="Times New Roman" w:hAnsi="Times New Roman" w:cs="Times New Roman"/>
+        </w:rPr>
+        <w:t>Application software</w:t>
+      </w:r>
+    </w:p>
+    <w:p>
+      <w:pPr>
+        <w:widowControl/>
+        <w:numPr>
+          <w:ilvl w:val="0"/>
+          <w:numId w:val="8"/>
+        </w:numPr>
+        <w:spacing w:beforeAutospacing="1" w:afterAutospacing="1"/>
+        <w:rPr>
+          <w:rFonts w:ascii="Times New Roman" w:hAnsi="Times New Roman" w:cs="Times New Roman"/>
+        </w:rPr>
+      </w:pPr>
+      <w:r>
+        <w:rPr>
+          <w:rFonts w:ascii="Times New Roman" w:hAnsi="Times New Roman" w:cs="Times New Roman"/>
+        </w:rPr>
+        <w:t>Deployment documentation</w:t>
+      </w:r>
+    </w:p>
+    <w:p>
+      <w:pPr>
+        <w:widowControl/>
+        <w:numPr>
+          <w:ilvl w:val="0"/>
+          <w:numId w:val="8"/>
+        </w:numPr>
+        <w:spacing w:beforeAutospacing="1" w:afterAutospacing="1"/>
+        <w:rPr>
+          <w:rFonts w:ascii="Times New Roman" w:hAnsi="Times New Roman" w:cs="Times New Roman"/>
+        </w:rPr>
+      </w:pPr>
+      <w:r>
+        <w:rPr>
+          <w:rFonts w:ascii="Times New Roman" w:hAnsi="Times New Roman" w:cs="Times New Roman"/>
+        </w:rPr>
+        <w:t>Configuration guidance</w:t>
+      </w:r>
+    </w:p>
+    <w:p>
+      <w:pPr>
+        <w:widowControl/>
+        <w:numPr>
+          <w:ilvl w:val="0"/>
+          <w:numId w:val="8"/>
+        </w:numPr>
+        <w:spacing w:beforeAutospacing="1" w:afterAutospacing="1"/>
+        <w:rPr>
+          <w:rFonts w:ascii="Times New Roman" w:hAnsi="Times New Roman" w:cs="Times New Roman"/>
+        </w:rPr>
+      </w:pPr>
+      <w:r>
+        <w:rPr>
+          <w:rFonts w:ascii="Times New Roman" w:hAnsi="Times New Roman" w:cs="Times New Roman"/>
+        </w:rPr>
+        <w:t>Authentication and authorization design</w:t>
+      </w:r>
+    </w:p>
+    <w:p>
+      <w:pPr>
+        <w:widowControl/>
+        <w:numPr>
+          <w:ilvl w:val="0"/>
+          <w:numId w:val="8"/>
+        </w:numPr>
+        <w:spacing w:beforeAutospacing="1" w:afterAutospacing="1"/>
+        <w:rPr>
+          <w:rFonts w:ascii="Times New Roman" w:hAnsi="Times New Roman" w:cs="Times New Roman"/>
+        </w:rPr>
+      </w:pPr>
+      <w:r>
+        <w:rPr>
+          <w:rFonts w:ascii="Times New Roman" w:hAnsi="Times New Roman" w:cs="Times New Roman"/>
+        </w:rPr>
+        <w:t>Safe default settings</w:t>
+      </w:r>
+    </w:p>
+    <w:p>
+      <w:pPr>
+        <w:widowControl/>
+        <w:numPr>
+          <w:ilvl w:val="0"/>
+          <w:numId w:val="8"/>
+        </w:numPr>
+        <w:spacing w:beforeAutospacing="1" w:afterAutospacing="1"/>
+        <w:rPr>
+          <w:rFonts w:ascii="Times New Roman" w:hAnsi="Times New Roman" w:cs="Times New Roman"/>
+        </w:rPr>
+      </w:pPr>
+      <w:r>
+        <w:rPr>
+          <w:rFonts w:ascii="Times New Roman" w:hAnsi="Times New Roman" w:cs="Times New Roman"/>
+        </w:rPr>
+        <w:t>Update instructions for the MVP</w:t>
+      </w:r>
+    </w:p>
+    <w:p>
+      <w:pPr>
+        <w:pStyle w:val="4"/>
         <w:widowControl/>
         <w:rPr>
           <w:rFonts w:ascii="Times New Roman" w:hAnsi="Times New Roman" w:hint="default"/>
@@ -1560,7 +1800,7 @@
         <w:rPr>
           <w:rFonts w:ascii="Times New Roman" w:hAnsi="Times New Roman" w:hint="default"/>
         </w:rPr>
-        <w:t>Option A: Customer Fully Responsible</w:t>
+        <w:t>Consequence</w:t>
       </w:r>
     </w:p>
     <w:p>
@@ -1575,7 +1815,53 @@
         <w:rPr>
           <w:rFonts w:ascii="Times New Roman" w:hAnsi="Times New Roman"/>
         </w:rPr>
-        <w:t>The customer is fully responsible for the infrastructure required to run the platform.</w:t>
+        <w:t>This is more realistic and professional, but it creates additional responsibility for the development team because deployment requirements and secure defaults must be clearly documented.</w:t>
+      </w:r>
+    </w:p>
+    <w:p>
+      <w:pPr>
+        <w:pStyle w:val="a4"/>
+      </w:pPr>
+    </w:p>
+    <w:p>
+      <w:pPr>
+        <w:pStyle w:val="a4"/>
+      </w:pPr>
+    </w:p>
+    <w:p>
+      <w:pPr>
+        <w:pStyle w:val="a4"/>
+      </w:pPr>
+    </w:p>
+    <w:p>
+      <w:pPr>
+        <w:pStyle w:val="a4"/>
+      </w:pPr>
+    </w:p>
+    <w:p>
+      <w:pPr>
+        <w:pStyle w:val="a4"/>
+      </w:pPr>
+    </w:p>
+    <w:p>
+      <w:pPr>
+        <w:pStyle w:val="a4"/>
+      </w:pPr>
+    </w:p>
+    <w:p>
+      <w:pPr>
+        <w:pStyle w:val="2"/>
+        <w:widowControl/>
+        <w:rPr>
+          <w:rFonts w:ascii="Times New Roman" w:hAnsi="Times New Roman" w:hint="default"/>
+        </w:rPr>
+      </w:pPr>
+      <w:r>
+        <w:rPr>
+          <w:rFonts w:ascii="Times New Roman" w:hAnsi="Times New Roman" w:hint="default"/>
+        </w:rPr>
+        <w:lastRenderedPageBreak/>
+        <w:t>Summary</w:t>
       </w:r>
     </w:p>
     <w:p>
@@ -1590,159 +1876,7 @@
         <w:rPr>
           <w:rFonts w:ascii="Times New Roman" w:hAnsi="Times New Roman"/>
         </w:rPr>
-        <w:t>This includes:</w:t>
-      </w:r>
-    </w:p>
-    <w:p>
-      <w:pPr>
-        <w:widowControl/>
-        <w:numPr>
-          <w:ilvl w:val="0"/>
-          <w:numId w:val="6"/>
-        </w:numPr>
-        <w:spacing w:beforeAutospacing="1" w:afterAutospacing="1"/>
-        <w:rPr>
-          <w:rFonts w:ascii="Times New Roman" w:hAnsi="Times New Roman" w:cs="Times New Roman"/>
-        </w:rPr>
-      </w:pPr>
-      <w:r>
-        <w:rPr>
-          <w:rFonts w:ascii="Times New Roman" w:hAnsi="Times New Roman" w:cs="Times New Roman"/>
-        </w:rPr>
-        <w:t>Server hardware or virtual machine</w:t>
-      </w:r>
-    </w:p>
-    <w:p>
-      <w:pPr>
-        <w:widowControl/>
-        <w:numPr>
-          <w:ilvl w:val="0"/>
-          <w:numId w:val="6"/>
-        </w:numPr>
-        <w:spacing w:beforeAutospacing="1" w:afterAutospacing="1"/>
-        <w:rPr>
-          <w:rFonts w:ascii="Times New Roman" w:hAnsi="Times New Roman" w:cs="Times New Roman"/>
-        </w:rPr>
-      </w:pPr>
-      <w:r>
-        <w:rPr>
-          <w:rFonts w:ascii="Times New Roman" w:hAnsi="Times New Roman" w:cs="Times New Roman"/>
-        </w:rPr>
-        <w:t>Network configuration</w:t>
-      </w:r>
-    </w:p>
-    <w:p>
-      <w:pPr>
-        <w:widowControl/>
-        <w:numPr>
-          <w:ilvl w:val="0"/>
-          <w:numId w:val="6"/>
-        </w:numPr>
-        <w:spacing w:beforeAutospacing="1" w:afterAutospacing="1"/>
-        <w:rPr>
-          <w:rFonts w:ascii="Times New Roman" w:hAnsi="Times New Roman" w:cs="Times New Roman"/>
-        </w:rPr>
-      </w:pPr>
-      <w:r>
-        <w:rPr>
-          <w:rFonts w:ascii="Times New Roman" w:hAnsi="Times New Roman" w:cs="Times New Roman"/>
-        </w:rPr>
-        <w:t>Storage</w:t>
-      </w:r>
-    </w:p>
-    <w:p>
-      <w:pPr>
-        <w:widowControl/>
-        <w:numPr>
-          <w:ilvl w:val="0"/>
-          <w:numId w:val="6"/>
-        </w:numPr>
-        <w:spacing w:beforeAutospacing="1" w:afterAutospacing="1"/>
-        <w:rPr>
-          <w:rFonts w:ascii="Times New Roman" w:hAnsi="Times New Roman" w:cs="Times New Roman"/>
-        </w:rPr>
-      </w:pPr>
-      <w:r>
-        <w:rPr>
-          <w:rFonts w:ascii="Times New Roman" w:hAnsi="Times New Roman" w:cs="Times New Roman"/>
-        </w:rPr>
-        <w:t>Backups</w:t>
-      </w:r>
-    </w:p>
-    <w:p>
-      <w:pPr>
-        <w:widowControl/>
-        <w:numPr>
-          <w:ilvl w:val="0"/>
-          <w:numId w:val="6"/>
-        </w:numPr>
-        <w:spacing w:beforeAutospacing="1" w:afterAutospacing="1"/>
-        <w:rPr>
-          <w:rFonts w:ascii="Times New Roman" w:hAnsi="Times New Roman" w:cs="Times New Roman"/>
-        </w:rPr>
-      </w:pPr>
-      <w:r>
-        <w:rPr>
-          <w:rFonts w:ascii="Times New Roman" w:hAnsi="Times New Roman" w:cs="Times New Roman"/>
-        </w:rPr>
-        <w:t>CPU/GPU resources</w:t>
-      </w:r>
-    </w:p>
-    <w:p>
-      <w:pPr>
-        <w:widowControl/>
-        <w:numPr>
-          <w:ilvl w:val="0"/>
-          <w:numId w:val="6"/>
-        </w:numPr>
-        <w:spacing w:beforeAutospacing="1" w:afterAutospacing="1"/>
-        <w:rPr>
-          <w:rFonts w:ascii="Times New Roman" w:hAnsi="Times New Roman" w:cs="Times New Roman"/>
-        </w:rPr>
-      </w:pPr>
-      <w:r>
-        <w:rPr>
-          <w:rFonts w:ascii="Times New Roman" w:hAnsi="Times New Roman" w:cs="Times New Roman"/>
-        </w:rPr>
-        <w:t>Operating system updates</w:t>
-      </w:r>
-    </w:p>
-    <w:p>
-      <w:pPr>
-        <w:widowControl/>
-        <w:numPr>
-          <w:ilvl w:val="0"/>
-          <w:numId w:val="6"/>
-        </w:numPr>
-        <w:spacing w:beforeAutospacing="1" w:afterAutospacing="1"/>
-        <w:rPr>
-          <w:rFonts w:ascii="Times New Roman" w:hAnsi="Times New Roman" w:cs="Times New Roman"/>
-        </w:rPr>
-      </w:pPr>
-      <w:r>
-        <w:rPr>
-          <w:rFonts w:ascii="Times New Roman" w:hAnsi="Times New Roman" w:cs="Times New Roman"/>
-        </w:rPr>
-        <w:t>Remote access configuration</w:t>
-      </w:r>
-    </w:p>
-    <w:p>
-      <w:pPr>
-        <w:widowControl/>
-        <w:numPr>
-          <w:ilvl w:val="0"/>
-          <w:numId w:val="6"/>
-        </w:numPr>
-        <w:spacing w:beforeAutospacing="1" w:afterAutospacing="1"/>
-        <w:rPr>
-          <w:rFonts w:ascii="Times New Roman" w:hAnsi="Times New Roman" w:cs="Times New Roman"/>
-        </w:rPr>
-      </w:pPr>
-      <w:r>
-        <w:rPr>
-          <w:rFonts w:ascii="Times New Roman" w:hAnsi="Times New Roman" w:cs="Times New Roman"/>
-        </w:rPr>
-        <w:t>Infrastructure-level security</w:t>
+        <w:t>The MVP deployment model is a centralized, customer/team-controlled shared server.</w:t>
       </w:r>
     </w:p>
     <w:p>
@@ -1757,60 +1891,23 @@
         <w:rPr>
           <w:rFonts w:ascii="Times New Roman" w:hAnsi="Times New Roman"/>
         </w:rPr>
-        <w:t>The development team provides the application software, but infrastructure operation is outside the MVP responsibility.</w:t>
-      </w:r>
-    </w:p>
-    <w:p>
-      <w:pPr>
-        <w:pStyle w:val="4"/>
-        <w:widowControl/>
-        <w:rPr>
-          <w:rFonts w:ascii="Times New Roman" w:hAnsi="Times New Roman" w:hint="default"/>
-        </w:rPr>
-      </w:pPr>
-      <w:r>
-        <w:rPr>
-          <w:rFonts w:ascii="Times New Roman" w:hAnsi="Times New Roman" w:hint="default"/>
-        </w:rPr>
-        <w:t>Consequence</w:t>
+        <w:t>The platform will not use per-user full local deployment for the MVP.</w:t>
       </w:r>
     </w:p>
     <w:p>
       <w:pPr>
         <w:pStyle w:val="Web"/>
         <w:widowControl/>
-        <w:rPr>
-          <w:rFonts w:ascii="Times New Roman" w:hAnsi="Times New Roman"/>
-        </w:rPr>
-      </w:pPr>
-      <w:r>
-        <w:rPr>
-          <w:rFonts w:ascii="Times New Roman" w:hAnsi="Times New Roman"/>
-        </w:rPr>
-        <w:t>This provides a clear boundary, but it may make the product appear to offer limited deployment support.</w:t>
-      </w:r>
-    </w:p>
-    <w:p>
-      <w:pPr>
-        <w:widowControl/>
-        <w:rPr>
-          <w:rFonts w:ascii="Times New Roman" w:hAnsi="Times New Roman" w:cs="Times New Roman"/>
-        </w:rPr>
-      </w:pPr>
-    </w:p>
-    <w:p>
-      <w:pPr>
-        <w:pStyle w:val="3"/>
-        <w:widowControl/>
-        <w:rPr>
-          <w:rFonts w:ascii="Times New Roman" w:hAnsi="Times New Roman" w:hint="default"/>
-        </w:rPr>
-      </w:pPr>
-      <w:r>
-        <w:rPr>
-          <w:rFonts w:ascii="Times New Roman" w:hAnsi="Times New Roman" w:hint="default"/>
-        </w:rPr>
-        <w:t>Option B: Shared Responsibility</w:t>
+        <w:ind w:firstLine="420"/>
+        <w:rPr>
+          <w:rFonts w:ascii="Times New Roman" w:hAnsi="Times New Roman"/>
+        </w:rPr>
+      </w:pPr>
+      <w:r>
+        <w:rPr>
+          <w:rFonts w:ascii="Times New Roman" w:hAnsi="Times New Roman"/>
+        </w:rPr>
+        <w:t>The application, database, workflow engine, GitHub integration, and AI runtime may run in one shared server environment, while the internal system architecture remains modular.</w:t>
       </w:r>
     </w:p>
     <w:p>
@@ -1825,155 +1922,23 @@
         <w:rPr>
           <w:rFonts w:ascii="Times New Roman" w:hAnsi="Times New Roman"/>
         </w:rPr>
-        <w:t>The customer is responsible for the infrastructure environment, while the development team is responsible for providing the software, deployment guidance, and secure configuration design.</w:t>
+        <w:t>Users access the platform through a browser.</w:t>
       </w:r>
     </w:p>
     <w:p>
       <w:pPr>
         <w:pStyle w:val="Web"/>
         <w:widowControl/>
-        <w:rPr>
-          <w:rFonts w:ascii="Times New Roman" w:hAnsi="Times New Roman"/>
-        </w:rPr>
-      </w:pPr>
-      <w:r>
-        <w:rPr>
-          <w:rFonts w:ascii="Times New Roman" w:hAnsi="Times New Roman"/>
-        </w:rPr>
-        <w:t>Customer responsibilities include:</w:t>
-      </w:r>
-    </w:p>
-    <w:p>
-      <w:pPr>
-        <w:widowControl/>
-        <w:numPr>
-          <w:ilvl w:val="0"/>
-          <w:numId w:val="7"/>
-        </w:numPr>
-        <w:spacing w:beforeAutospacing="1" w:afterAutospacing="1"/>
-        <w:rPr>
-          <w:rFonts w:ascii="Times New Roman" w:hAnsi="Times New Roman" w:cs="Times New Roman"/>
-        </w:rPr>
-      </w:pPr>
-      <w:r>
-        <w:rPr>
-          <w:rFonts w:ascii="Times New Roman" w:hAnsi="Times New Roman" w:cs="Times New Roman"/>
-        </w:rPr>
-        <w:t>Server or virtual machine</w:t>
-      </w:r>
-    </w:p>
-    <w:p>
-      <w:pPr>
-        <w:widowControl/>
-        <w:numPr>
-          <w:ilvl w:val="0"/>
-          <w:numId w:val="7"/>
-        </w:numPr>
-        <w:spacing w:beforeAutospacing="1" w:afterAutospacing="1"/>
-        <w:rPr>
-          <w:rFonts w:ascii="Times New Roman" w:hAnsi="Times New Roman" w:cs="Times New Roman"/>
-        </w:rPr>
-      </w:pPr>
-      <w:r>
-        <w:rPr>
-          <w:rFonts w:ascii="Times New Roman" w:hAnsi="Times New Roman" w:cs="Times New Roman"/>
-        </w:rPr>
-        <w:t>Network access</w:t>
-      </w:r>
-    </w:p>
-    <w:p>
-      <w:pPr>
-        <w:widowControl/>
-        <w:numPr>
-          <w:ilvl w:val="0"/>
-          <w:numId w:val="7"/>
-        </w:numPr>
-        <w:spacing w:beforeAutospacing="1" w:afterAutospacing="1"/>
-        <w:rPr>
-          <w:rFonts w:ascii="Times New Roman" w:hAnsi="Times New Roman" w:cs="Times New Roman"/>
-        </w:rPr>
-      </w:pPr>
-      <w:r>
-        <w:rPr>
-          <w:rFonts w:ascii="Times New Roman" w:hAnsi="Times New Roman" w:cs="Times New Roman"/>
-        </w:rPr>
-        <w:t>Storage</w:t>
-      </w:r>
-    </w:p>
-    <w:p>
-      <w:pPr>
-        <w:widowControl/>
-        <w:numPr>
-          <w:ilvl w:val="0"/>
-          <w:numId w:val="7"/>
-        </w:numPr>
-        <w:spacing w:beforeAutospacing="1" w:afterAutospacing="1"/>
-        <w:rPr>
-          <w:rFonts w:ascii="Times New Roman" w:hAnsi="Times New Roman" w:cs="Times New Roman"/>
-        </w:rPr>
-      </w:pPr>
-      <w:r>
-        <w:rPr>
-          <w:rFonts w:ascii="Times New Roman" w:hAnsi="Times New Roman" w:cs="Times New Roman"/>
-        </w:rPr>
-        <w:t>Backup policy</w:t>
-      </w:r>
-    </w:p>
-    <w:p>
-      <w:pPr>
-        <w:widowControl/>
-        <w:numPr>
-          <w:ilvl w:val="0"/>
-          <w:numId w:val="7"/>
-        </w:numPr>
-        <w:spacing w:beforeAutospacing="1" w:afterAutospacing="1"/>
-        <w:rPr>
-          <w:rFonts w:ascii="Times New Roman" w:hAnsi="Times New Roman" w:cs="Times New Roman"/>
-        </w:rPr>
-      </w:pPr>
-      <w:r>
-        <w:rPr>
-          <w:rFonts w:ascii="Times New Roman" w:hAnsi="Times New Roman" w:cs="Times New Roman"/>
-        </w:rPr>
-        <w:t>CPU/GPU resources</w:t>
-      </w:r>
-    </w:p>
-    <w:p>
-      <w:pPr>
-        <w:widowControl/>
-        <w:numPr>
-          <w:ilvl w:val="0"/>
-          <w:numId w:val="7"/>
-        </w:numPr>
-        <w:spacing w:beforeAutospacing="1" w:afterAutospacing="1"/>
-        <w:rPr>
-          <w:rFonts w:ascii="Times New Roman" w:hAnsi="Times New Roman" w:cs="Times New Roman"/>
-        </w:rPr>
-      </w:pPr>
-      <w:r>
-        <w:rPr>
-          <w:rFonts w:ascii="Times New Roman" w:hAnsi="Times New Roman" w:cs="Times New Roman"/>
-        </w:rPr>
-        <w:t>Remote access through VPN or tunneling if needed</w:t>
-      </w:r>
-    </w:p>
-    <w:p>
-      <w:pPr>
-        <w:widowControl/>
-        <w:numPr>
-          <w:ilvl w:val="0"/>
-          <w:numId w:val="7"/>
-        </w:numPr>
-        <w:spacing w:beforeAutospacing="1" w:afterAutospacing="1"/>
-        <w:rPr>
-          <w:rFonts w:ascii="Times New Roman" w:hAnsi="Times New Roman" w:cs="Times New Roman"/>
-        </w:rPr>
-      </w:pPr>
-      <w:r>
-        <w:rPr>
-          <w:rFonts w:ascii="Times New Roman" w:hAnsi="Times New Roman" w:cs="Times New Roman"/>
-        </w:rPr>
-        <w:t>Infrastructure-level security</w:t>
+        <w:ind w:firstLine="420"/>
+        <w:rPr>
+          <w:rFonts w:ascii="Times New Roman" w:hAnsi="Times New Roman"/>
+        </w:rPr>
+      </w:pPr>
+      <w:r>
+        <w:rPr>
+          <w:rFonts w:ascii="Times New Roman" w:hAnsi="Times New Roman"/>
+        </w:rPr>
+        <w:t>Remote access may be supported through customer-managed VPN or tunneling, but public internet exposure is outside the MVP scope.</w:t>
       </w:r>
     </w:p>
     <w:p>
@@ -1988,436 +1953,7 @@
         <w:rPr>
           <w:rFonts w:ascii="Times New Roman" w:hAnsi="Times New Roman"/>
         </w:rPr>
-        <w:lastRenderedPageBreak/>
-        <w:t>Development team responsibilities include:</w:t>
-      </w:r>
-    </w:p>
-    <w:p>
-      <w:pPr>
-        <w:widowControl/>
-        <w:numPr>
-          <w:ilvl w:val="0"/>
-          <w:numId w:val="8"/>
-        </w:numPr>
-        <w:spacing w:beforeAutospacing="1" w:afterAutospacing="1"/>
-        <w:rPr>
-          <w:rFonts w:ascii="Times New Roman" w:hAnsi="Times New Roman" w:cs="Times New Roman"/>
-        </w:rPr>
-      </w:pPr>
-      <w:r>
-        <w:rPr>
-          <w:rFonts w:ascii="Times New Roman" w:hAnsi="Times New Roman" w:cs="Times New Roman"/>
-        </w:rPr>
-        <w:t>Application software</w:t>
-      </w:r>
-    </w:p>
-    <w:p>
-      <w:pPr>
-        <w:widowControl/>
-        <w:numPr>
-          <w:ilvl w:val="0"/>
-          <w:numId w:val="8"/>
-        </w:numPr>
-        <w:spacing w:beforeAutospacing="1" w:afterAutospacing="1"/>
-        <w:rPr>
-          <w:rFonts w:ascii="Times New Roman" w:hAnsi="Times New Roman" w:cs="Times New Roman"/>
-        </w:rPr>
-      </w:pPr>
-      <w:r>
-        <w:rPr>
-          <w:rFonts w:ascii="Times New Roman" w:hAnsi="Times New Roman" w:cs="Times New Roman"/>
-        </w:rPr>
-        <w:t>Deployment documentation</w:t>
-      </w:r>
-    </w:p>
-    <w:p>
-      <w:pPr>
-        <w:widowControl/>
-        <w:numPr>
-          <w:ilvl w:val="0"/>
-          <w:numId w:val="8"/>
-        </w:numPr>
-        <w:spacing w:beforeAutospacing="1" w:afterAutospacing="1"/>
-        <w:rPr>
-          <w:rFonts w:ascii="Times New Roman" w:hAnsi="Times New Roman" w:cs="Times New Roman"/>
-        </w:rPr>
-      </w:pPr>
-      <w:r>
-        <w:rPr>
-          <w:rFonts w:ascii="Times New Roman" w:hAnsi="Times New Roman" w:cs="Times New Roman"/>
-        </w:rPr>
-        <w:t>Configuration guidance</w:t>
-      </w:r>
-    </w:p>
-    <w:p>
-      <w:pPr>
-        <w:widowControl/>
-        <w:numPr>
-          <w:ilvl w:val="0"/>
-          <w:numId w:val="8"/>
-        </w:numPr>
-        <w:spacing w:beforeAutospacing="1" w:afterAutospacing="1"/>
-        <w:rPr>
-          <w:rFonts w:ascii="Times New Roman" w:hAnsi="Times New Roman" w:cs="Times New Roman"/>
-        </w:rPr>
-      </w:pPr>
-      <w:r>
-        <w:rPr>
-          <w:rFonts w:ascii="Times New Roman" w:hAnsi="Times New Roman" w:cs="Times New Roman"/>
-        </w:rPr>
-        <w:t>Authentication and authorization design</w:t>
-      </w:r>
-    </w:p>
-    <w:p>
-      <w:pPr>
-        <w:widowControl/>
-        <w:numPr>
-          <w:ilvl w:val="0"/>
-          <w:numId w:val="8"/>
-        </w:numPr>
-        <w:spacing w:beforeAutospacing="1" w:afterAutospacing="1"/>
-        <w:rPr>
-          <w:rFonts w:ascii="Times New Roman" w:hAnsi="Times New Roman" w:cs="Times New Roman"/>
-        </w:rPr>
-      </w:pPr>
-      <w:r>
-        <w:rPr>
-          <w:rFonts w:ascii="Times New Roman" w:hAnsi="Times New Roman" w:cs="Times New Roman"/>
-        </w:rPr>
-        <w:t>Safe default settings</w:t>
-      </w:r>
-    </w:p>
-    <w:p>
-      <w:pPr>
-        <w:widowControl/>
-        <w:numPr>
-          <w:ilvl w:val="0"/>
-          <w:numId w:val="8"/>
-        </w:numPr>
-        <w:spacing w:beforeAutospacing="1" w:afterAutospacing="1"/>
-        <w:rPr>
-          <w:rFonts w:ascii="Times New Roman" w:hAnsi="Times New Roman" w:cs="Times New Roman"/>
-        </w:rPr>
-      </w:pPr>
-      <w:r>
-        <w:rPr>
-          <w:rFonts w:ascii="Times New Roman" w:hAnsi="Times New Roman" w:cs="Times New Roman"/>
-        </w:rPr>
-        <w:t>Update instructions for the MVP</w:t>
-      </w:r>
-    </w:p>
-    <w:p>
-      <w:pPr>
-        <w:pStyle w:val="4"/>
-        <w:widowControl/>
-        <w:rPr>
-          <w:rFonts w:ascii="Times New Roman" w:hAnsi="Times New Roman" w:hint="default"/>
-        </w:rPr>
-      </w:pPr>
-      <w:r>
-        <w:rPr>
-          <w:rFonts w:ascii="Times New Roman" w:hAnsi="Times New Roman" w:hint="default"/>
-        </w:rPr>
-        <w:t>Consequence</w:t>
-      </w:r>
-    </w:p>
-    <w:p>
-      <w:pPr>
-        <w:pStyle w:val="Web"/>
-        <w:widowControl/>
-        <w:rPr>
-          <w:rFonts w:ascii="Times New Roman" w:hAnsi="Times New Roman"/>
-        </w:rPr>
-      </w:pPr>
-      <w:r>
-        <w:rPr>
-          <w:rFonts w:ascii="Times New Roman" w:hAnsi="Times New Roman"/>
-        </w:rPr>
-        <w:t>This is more realistic and professional, but it creates additional responsibility for the development team because deployment requirements and secure defaults must be clearly documented.</w:t>
-      </w:r>
-    </w:p>
-    <w:p>
-      <w:pPr>
-        <w:pStyle w:val="Web"/>
-        <w:widowControl/>
-        <w:rPr>
-          <w:rFonts w:ascii="Times New Roman" w:hAnsi="Times New Roman"/>
-        </w:rPr>
-      </w:pPr>
-      <w:r>
-        <w:rPr>
-          <w:rFonts w:ascii="Times New Roman" w:hAnsi="Times New Roman"/>
-        </w:rPr>
-        <w:t xml:space="preserve">The best option is option B. The development team must provide as </w:t>
-      </w:r>
-      <w:proofErr w:type="gramStart"/>
-      <w:r>
-        <w:rPr>
-          <w:rFonts w:ascii="Times New Roman" w:hAnsi="Times New Roman"/>
-        </w:rPr>
-        <w:t>much</w:t>
-      </w:r>
-      <w:proofErr w:type="gramEnd"/>
-      <w:r>
-        <w:rPr>
-          <w:rFonts w:ascii="Times New Roman" w:hAnsi="Times New Roman"/>
-        </w:rPr>
-        <w:t xml:space="preserve"> services as the company needs to run the app. We are responsible for configuration guidance, updates, authentication and authorization design and safe default </w:t>
-      </w:r>
-      <w:proofErr w:type="gramStart"/>
-      <w:r>
-        <w:rPr>
-          <w:rFonts w:ascii="Times New Roman" w:hAnsi="Times New Roman"/>
-        </w:rPr>
-        <w:t>setting</w:t>
-      </w:r>
-      <w:proofErr w:type="gramEnd"/>
-      <w:r>
-        <w:rPr>
-          <w:rFonts w:ascii="Times New Roman" w:hAnsi="Times New Roman"/>
-        </w:rPr>
-        <w:t xml:space="preserve">. We are also responsible </w:t>
-      </w:r>
-      <w:proofErr w:type="gramStart"/>
-      <w:r>
-        <w:rPr>
-          <w:rFonts w:ascii="Times New Roman" w:hAnsi="Times New Roman"/>
-        </w:rPr>
-        <w:t>to install</w:t>
-      </w:r>
-      <w:proofErr w:type="gramEnd"/>
-      <w:r>
-        <w:rPr>
-          <w:rFonts w:ascii="Times New Roman" w:hAnsi="Times New Roman"/>
-        </w:rPr>
-        <w:t xml:space="preserve"> new patches </w:t>
-      </w:r>
-      <w:proofErr w:type="gramStart"/>
-      <w:r>
-        <w:rPr>
-          <w:rFonts w:ascii="Times New Roman" w:hAnsi="Times New Roman"/>
-        </w:rPr>
-        <w:t>etc..</w:t>
-      </w:r>
-      <w:proofErr w:type="gramEnd"/>
-      <w:r>
-        <w:rPr>
-          <w:rFonts w:ascii="Times New Roman" w:hAnsi="Times New Roman"/>
-        </w:rPr>
-        <w:t xml:space="preserve"> How to install the new patches is a problem that we </w:t>
-      </w:r>
-      <w:proofErr w:type="gramStart"/>
-      <w:r>
-        <w:rPr>
-          <w:rFonts w:ascii="Times New Roman" w:hAnsi="Times New Roman"/>
-        </w:rPr>
-        <w:t>have to</w:t>
-      </w:r>
-      <w:proofErr w:type="gramEnd"/>
-      <w:r>
-        <w:rPr>
-          <w:rFonts w:ascii="Times New Roman" w:hAnsi="Times New Roman"/>
-        </w:rPr>
-        <w:t xml:space="preserve"> solve later. </w:t>
-      </w:r>
-    </w:p>
-    <w:p>
-      <w:pPr>
-        <w:pStyle w:val="a4"/>
-      </w:pPr>
-    </w:p>
-    <w:p>
-      <w:pPr>
-        <w:pStyle w:val="a4"/>
-      </w:pPr>
-    </w:p>
-    <w:p>
-      <w:pPr>
-        <w:pStyle w:val="a4"/>
-      </w:pPr>
-    </w:p>
-    <w:p>
-      <w:pPr>
-        <w:pStyle w:val="a4"/>
-      </w:pPr>
-    </w:p>
-    <w:p>
-      <w:pPr>
-        <w:pStyle w:val="a4"/>
-      </w:pPr>
-    </w:p>
-    <w:p>
-      <w:pPr>
-        <w:pStyle w:val="a4"/>
-      </w:pPr>
-    </w:p>
-    <w:p>
-      <w:pPr>
-        <w:pStyle w:val="a4"/>
-      </w:pPr>
-    </w:p>
-    <w:p>
-      <w:pPr>
-        <w:pStyle w:val="a4"/>
-      </w:pPr>
-    </w:p>
-    <w:p>
-      <w:pPr>
-        <w:pStyle w:val="a4"/>
-      </w:pPr>
-    </w:p>
-    <w:p>
-      <w:pPr>
-        <w:pStyle w:val="a4"/>
-      </w:pPr>
-    </w:p>
-    <w:p>
-      <w:pPr>
-        <w:pStyle w:val="a4"/>
-      </w:pPr>
-    </w:p>
-    <w:p>
-      <w:pPr>
-        <w:pStyle w:val="a4"/>
-      </w:pPr>
-    </w:p>
-    <w:p>
-      <w:pPr>
-        <w:pStyle w:val="a4"/>
-      </w:pPr>
-    </w:p>
-    <w:p>
-      <w:pPr>
-        <w:pStyle w:val="a4"/>
-      </w:pPr>
-    </w:p>
-    <w:p>
-      <w:pPr>
-        <w:pStyle w:val="a4"/>
-      </w:pPr>
-    </w:p>
-    <w:p>
-      <w:pPr>
-        <w:pStyle w:val="a4"/>
-      </w:pPr>
-    </w:p>
-    <w:p>
-      <w:pPr>
-        <w:pStyle w:val="2"/>
-        <w:widowControl/>
-        <w:rPr>
-          <w:rFonts w:ascii="Times New Roman" w:hAnsi="Times New Roman" w:hint="default"/>
-        </w:rPr>
-      </w:pPr>
-      <w:r>
-        <w:rPr>
-          <w:rFonts w:ascii="Times New Roman" w:hAnsi="Times New Roman" w:hint="default"/>
-        </w:rPr>
-        <w:t>Summary</w:t>
-      </w:r>
-    </w:p>
-    <w:p>
-      <w:pPr>
-        <w:pStyle w:val="Web"/>
-        <w:widowControl/>
-        <w:rPr>
-          <w:rFonts w:ascii="Times New Roman" w:hAnsi="Times New Roman"/>
-        </w:rPr>
-      </w:pPr>
-      <w:r>
-        <w:rPr>
-          <w:rFonts w:ascii="Times New Roman" w:hAnsi="Times New Roman"/>
-        </w:rPr>
-        <w:t>The MVP deployment model is a centralized, customer/team-controlled shared server.</w:t>
-      </w:r>
-    </w:p>
-    <w:p>
-      <w:pPr>
-        <w:pStyle w:val="Web"/>
-        <w:widowControl/>
-        <w:rPr>
-          <w:rFonts w:ascii="Times New Roman" w:hAnsi="Times New Roman"/>
-        </w:rPr>
-      </w:pPr>
-      <w:r>
-        <w:rPr>
-          <w:rFonts w:ascii="Times New Roman" w:hAnsi="Times New Roman"/>
-        </w:rPr>
-        <w:t>The platform will not use per-user full local deployment for the MVP.</w:t>
-      </w:r>
-    </w:p>
-    <w:p>
-      <w:pPr>
-        <w:pStyle w:val="Web"/>
-        <w:widowControl/>
-        <w:ind w:firstLine="420"/>
-        <w:rPr>
-          <w:rFonts w:ascii="Times New Roman" w:hAnsi="Times New Roman"/>
-        </w:rPr>
-      </w:pPr>
-      <w:r>
-        <w:rPr>
-          <w:rFonts w:ascii="Times New Roman" w:hAnsi="Times New Roman"/>
-        </w:rPr>
-        <w:t>The application, database, workflow engine, GitHub integration, and AI runtime may run in one shared server environment, while the internal system architecture remains modular.</w:t>
-      </w:r>
-    </w:p>
-    <w:p>
-      <w:pPr>
-        <w:pStyle w:val="Web"/>
-        <w:widowControl/>
-        <w:rPr>
-          <w:rFonts w:ascii="Times New Roman" w:hAnsi="Times New Roman"/>
-        </w:rPr>
-      </w:pPr>
-      <w:r>
-        <w:rPr>
-          <w:rFonts w:ascii="Times New Roman" w:hAnsi="Times New Roman"/>
-        </w:rPr>
-        <w:t>Users access the platform through a browser.</w:t>
-      </w:r>
-    </w:p>
-    <w:p>
-      <w:pPr>
-        <w:pStyle w:val="Web"/>
-        <w:widowControl/>
-        <w:ind w:firstLine="420"/>
-        <w:rPr>
-          <w:rFonts w:ascii="Times New Roman" w:hAnsi="Times New Roman"/>
-        </w:rPr>
-      </w:pPr>
-      <w:r>
-        <w:rPr>
-          <w:rFonts w:ascii="Times New Roman" w:hAnsi="Times New Roman"/>
-        </w:rPr>
-        <w:t>Remote access may be supported through customer-managed VPN or tunneling, but public internet exposure is outside the MVP scope.</w:t>
-      </w:r>
-    </w:p>
-    <w:p>
-      <w:pPr>
-        <w:pStyle w:val="Web"/>
-        <w:widowControl/>
-        <w:rPr>
-          <w:rFonts w:ascii="Times New Roman" w:hAnsi="Times New Roman"/>
-        </w:rPr>
-      </w:pPr>
-      <w:r>
-        <w:rPr>
-          <w:rFonts w:ascii="Times New Roman" w:hAnsi="Times New Roman"/>
-        </w:rPr>
-        <w:t xml:space="preserve">The development team is responsible for updates, </w:t>
-      </w:r>
-      <w:r>
-        <w:rPr>
-          <w:rFonts w:ascii="Times New Roman" w:hAnsi="Times New Roman"/>
-        </w:rPr>
-        <w:t>deployment guidance</w:t>
-      </w:r>
-      <w:r>
-        <w:rPr>
-          <w:rFonts w:ascii="Times New Roman" w:hAnsi="Times New Roman"/>
-        </w:rPr>
-        <w:t xml:space="preserve"> and secure configuration settings.</w:t>
+        <w:t>The development team is responsible for updates, deployment guidance and secure configuration settings.</w:t>
       </w:r>
     </w:p>
     <w:p>

</xml_diff>